<commit_message>
feat(be): add demolition-payment creation
</commit_message>
<xml_diff>
--- a/document-merge-service/kt_bern/templatefiles/form.docx
+++ b/document-merge-service/kt_bern/templatefiles/form.docx
@@ -1733,29 +1733,7 @@
                 <w:szCs w:val="18"/>
                 <w:lang w:val="fr-CH" w:eastAsia="zh-CN" w:bidi="hi-IN"/>
               </w:rPr>
-              <w:t>.type not in ["StaticQuestion", "FormQuestion"] and section.slug not in ["bestaetigung-v</w:t>
-            </w:r>
-            <w:r>
-              <w:rPr>
-                <w:rFonts w:eastAsia="Noto Sans CJK SC Regular" w:cs="Arial" w:ascii="Liberation Sans" w:hAnsi="Liberation Sans"/>
-                <w:color w:themeColor="accent1" w:val="4F81BD"/>
-                <w:kern w:val="2"/>
-                <w:sz w:val="18"/>
-                <w:szCs w:val="18"/>
-                <w:lang w:val="fr-CH" w:eastAsia="zh-CN" w:bidi="hi-IN"/>
-              </w:rPr>
-              <w:t>7</w:t>
-            </w:r>
-            <w:r>
-              <w:rPr>
-                <w:rFonts w:eastAsia="Noto Sans CJK SC Regular" w:cs="Arial" w:ascii="Liberation Sans" w:hAnsi="Liberation Sans"/>
-                <w:color w:themeColor="accent1" w:val="4F81BD"/>
-                <w:kern w:val="2"/>
-                <w:sz w:val="18"/>
-                <w:szCs w:val="18"/>
-                <w:lang w:val="fr-CH" w:eastAsia="zh-CN" w:bidi="hi-IN"/>
-              </w:rPr>
-              <w:t>", "bestaetigung-v5", "7-bestaetigung-vorabklaerung-v5", "7-bestaetigung-vorabklaerung-v4", "7-bestaetigung", "reklamegesuch-bestaetigung", "benuetzung-oeffentlichem-terrain-bestaetigung", "solaranlagen-bestaetigung", "heat-generator-confirmation", "heat-generator-confirmation-v2", "6-dokumente", "dokumente-hecken-feldgehoelze-baeume", "dokumente-v2", "dokumente-v3", "solaranlagen-dokumente"] %}</w:t>
+              <w:t>.type not in ["StaticQuestion", "FormQuestion"] and section.slug not in ["bestaetigung-v7", "bestaetigung-v5", "7-bestaetigung-vorabklaerung-v5", "7-bestaetigung-vorabklaerung-v4", "7-bestaetigung", "reklamegesuch-bestaetigung", "benuetzung-oeffentlichem-terrain-bestaetigung", "solaranlagen-bestaetigung", "heat-generator-confirmation", "heat-generator-confirmation-v2", "6-dokumente", "dokumente-hecken-feldgehoelze-baeume", "dokumente-v2", "dokumente-v3", "solaranlagen-dokumente", "antrag-auf-auszahlung-bestaetigung"] %}</w:t>
             </w:r>
           </w:p>
         </w:tc>
@@ -4947,7 +4925,17 @@
           <w:szCs w:val="18"/>
           <w:lang w:val="fr-CH" w:eastAsia="zh-CN" w:bidi="hi-IN"/>
         </w:rPr>
-        <w:t>"bestaetigung-v</w:t>
+        <w:t xml:space="preserve">"bestaetigung-v7", </w:t>
+      </w:r>
+      <w:r>
+        <w:rPr>
+          <w:rFonts w:cs="Arial" w:ascii="Liberation Sans" w:hAnsi="Liberation Sans"/>
+          <w:color w:themeColor="accent1" w:val="4F81BD"/>
+          <w:sz w:val="18"/>
+          <w:szCs w:val="18"/>
+          <w:lang w:val="fr-CH"/>
+        </w:rPr>
+        <w:t xml:space="preserve">"bestaetigung-v5", "7-bestaetigung-vorabklaerung-v5", "7-bestaetigung-vorabklaerung-v4", "7-bestaetigung", "reklamegesuch-bestaetigung", "benuetzung-oeffentlichem-terrain-bestaetigung", "solaranlagen-bestaetigung", "heat-generator-confirmation", "heat-generator-confirmation-v2", "6-dokumente", "dokumente-hecken-feldgehoelze-baeume", "dokumente-v2", "dokumente-v3", "solaranlagen-dokumente", </w:t>
       </w:r>
       <w:r>
         <w:rPr>
@@ -4958,18 +4946,7 @@
           <w:szCs w:val="18"/>
           <w:lang w:val="fr-CH" w:eastAsia="zh-CN" w:bidi="hi-IN"/>
         </w:rPr>
-        <w:t>7</w:t>
-      </w:r>
-      <w:r>
-        <w:rPr>
-          <w:rFonts w:eastAsia="Noto Sans CJK SC Regular" w:cs="Arial" w:ascii="Liberation Sans" w:hAnsi="Liberation Sans"/>
-          <w:color w:themeColor="accent1" w:val="4F81BD"/>
-          <w:kern w:val="2"/>
-          <w:sz w:val="18"/>
-          <w:szCs w:val="18"/>
-          <w:lang w:val="fr-CH" w:eastAsia="zh-CN" w:bidi="hi-IN"/>
-        </w:rPr>
-        <w:t xml:space="preserve">", </w:t>
+        <w:t>"antrag-auf-auszahlung-bestaetigung"</w:t>
       </w:r>
       <w:r>
         <w:rPr>
@@ -4979,7 +4956,7 @@
           <w:szCs w:val="18"/>
           <w:lang w:val="fr-CH"/>
         </w:rPr>
-        <w:t>"bestaetigung-v5", "7-bestaetigung-vorabklaerung-v5", "7-bestaetigung-vorabklaerung-v4", "7-bestaetigung", "reklamegesuch-bestaetigung", "benuetzung-oeffentlichem-terrain-bestaetigung", "solaranlagen-bestaetigung", "heat-generator-confirmation", "heat-generator-confirmation-v2", "6-dokumente", "dokumente-hecken-feldgehoelze-baeume", "dokumente-v2", "dokumente-v3", "solaranlagen-dokumente"] and subSection.type == "MultipleChoiceQuestion" and subSection.choices[0].checked %}</w:t>
+        <w:t>] and subSection.type == "MultipleChoiceQuestion" and subSection.choices[0].checked %}</w:t>
       </w:r>
     </w:p>
     <w:p>
@@ -5622,7 +5599,7 @@
           </v:handles>
           <o:lock v:ext="edit" text="t" shapetype="t"/>
         </v:shapetype>
-        <v:shape id="PowerPlusWaterMarkObject" o:spid="shape_0" adj="10800" fillcolor="silver" stroked="f" o:allowincell="f" style="position:absolute;margin-left:0.45pt;margin-top:308.9pt;width:445.45pt;height:110.6pt;mso-wrap-style:none;v-text-anchor:middle;rotation:315;mso-position-horizontal:center;mso-position-horizontal-relative:margin;mso-position-vertical:center;mso-position-vertical-relative:margin" type="_x0000_t136">
+        <v:shape id="PowerPlusWaterMarkObject" o:spid="shape_0" adj="10800" fillcolor="silver" stroked="f" o:allowincell="f" style="position:absolute;margin-left:0.5pt;margin-top:308.9pt;width:445.4pt;height:110.55pt;mso-wrap-style:none;v-text-anchor:middle;rotation:315;mso-position-horizontal:center;mso-position-horizontal-relative:margin;mso-position-vertical:center;mso-position-vertical-relative:margin" type="_x0000_t136">
           <v:path textpathok="t"/>
           <v:textpath on="t" fitshape="t" string="{{  draft  }}" style="font-family:&quot;Arial&quot;;font-size:1pt" trim="t"/>
           <v:fill o:detectmouseclick="t" type="solid" color2="#3f3f3f" opacity="0.5"/>
@@ -5690,7 +5667,7 @@
         </wp:anchor>
       </w:drawing>
       <w:pict>
-        <v:shape id="PowerPlusWaterMarkObject" o:spid="shape_0" adj="10800" fillcolor="silver" stroked="f" o:allowincell="f" style="position:absolute;margin-left:0.45pt;margin-top:308.9pt;width:445.45pt;height:110.6pt;mso-wrap-style:none;v-text-anchor:middle;rotation:315;mso-position-horizontal:center;mso-position-horizontal-relative:margin;mso-position-vertical:center;mso-position-vertical-relative:margin" type="_x0000_t136">
+        <v:shape id="PowerPlusWaterMarkObject" o:spid="shape_0" adj="10800" fillcolor="silver" stroked="f" o:allowincell="f" style="position:absolute;margin-left:0.5pt;margin-top:308.9pt;width:445.4pt;height:110.55pt;mso-wrap-style:none;v-text-anchor:middle;rotation:315;mso-position-horizontal:center;mso-position-horizontal-relative:margin;mso-position-vertical:center;mso-position-vertical-relative:margin" type="_x0000_t136">
           <v:path textpathok="t"/>
           <v:textpath on="t" fitshape="t" string="{{  draft  }}" style="font-family:&quot;Arial&quot;;font-size:1pt" trim="t"/>
           <v:fill o:detectmouseclick="t" type="solid" color2="#3f3f3f" opacity="0.5"/>

</xml_diff>